<commit_message>
docs: Projektdokumentation und finale Nachweise aktualisieren
</commit_message>
<xml_diff>
--- a/dokumentation/09_tests_fehler_und_devopsfaelle.docx
+++ b/dokumentation/09_tests_fehler_und_devopsfaelle.docx
@@ -152,10 +152,7 @@
           </w:tcPr>
           <w:p>
             <w:r>
-              <w:rPr>
-                <w:sz w:val="15"/>
-              </w:rPr>
-              <w:t>30/30 als Bestanden dokumentiert; T01–T29 besitzen testbezogene Screenshots. Für T30 war in der geprüften Screenshot-Sammlung kein eigener T30-Präfix vorhanden.</w:t>
+              <w:t>30/30 als Bestanden dokumentiert; T01–T30 besitzen testbezogene Nachweise. Für T30 liegt der Abschlussnachweis screenshots/21_tests/T30_prod_abnahme_e2e_http200.png vor.</w:t>
             </w:r>
           </w:p>
         </w:tc>
@@ -1349,10 +1346,7 @@
           </w:tcPr>
           <w:p>
             <w:r>
-              <w:rPr>
-                <w:sz w:val="14"/>
-              </w:rPr>
-              <w:t>Rollback: PR #37 gemergt; pacman-prod Synced/Healthy; PROD-IMAGE=2ae1f2e41c992fdbb81107aac79e66afe7ef2ea1; Rollout erfolgreich.</w:t>
+              <w:t>Rollback: PR #37 wurde am 2026-08-25 erfolgreich nach main gemergt; der vorherige Prod-Stand 2ae1f2e41c992fdbb81107aac79e66afe7ef2ea1 wurde wiederhergestellt; pacman-prod war Synced/Healthy und das Deployment wurde erfolgreich ausgerollt. Der aktuelle main-Stand wurde später wieder auf f62e055 zurückgesetzt.</w:t>
             </w:r>
           </w:p>
         </w:tc>
@@ -1363,10 +1357,7 @@
           </w:tcPr>
           <w:p>
             <w:r>
-              <w:rPr>
-                <w:sz w:val="14"/>
-              </w:rPr>
-              <w:t>Bestanden; Revert 8d81e09, Merge f051d60, PR #37</w:t>
+              <w:t>Bestanden; Revert 8d81e09; Merge f051d6087d7f0437b852c21f2045122f42ab1c22; PR #37</w:t>
             </w:r>
           </w:p>
         </w:tc>
@@ -1407,10 +1398,7 @@
           </w:tcPr>
           <w:p>
             <w:r>
-              <w:rPr>
-                <w:sz w:val="14"/>
-              </w:rPr>
-              <w:t>Bestanden; kein eigener T30-Präfix im geprüften Screenshot-Ordner</w:t>
+              <w:t>Bestanden; Nachweis: screenshots/21_tests/T30_prod_abnahme_e2e_http200.png</w:t>
             </w:r>
           </w:p>
         </w:tc>
@@ -3142,10 +3130,7 @@
           </w:tcPr>
           <w:p>
             <w:r>
-              <w:rPr>
-                <w:sz w:val="15"/>
-              </w:rPr>
-              <w:t>Tests T01–T29</w:t>
+              <w:t>Tests T01–T30</w:t>
             </w:r>
           </w:p>
         </w:tc>
@@ -3156,10 +3141,7 @@
           </w:tcPr>
           <w:p>
             <w:r>
-              <w:rPr>
-                <w:sz w:val="15"/>
-              </w:rPr>
-              <w:t>Testbezogene Screenshot-Dateien vorhanden.</w:t>
+              <w:t>Testbezogene Screenshot-/Log-Nachweise vorhanden; T30 besitzt einen eigenen Abschlussnachweis.</w:t>
             </w:r>
           </w:p>
         </w:tc>
@@ -3186,10 +3168,7 @@
           </w:tcPr>
           <w:p>
             <w:r>
-              <w:rPr>
-                <w:sz w:val="15"/>
-              </w:rPr>
-              <w:t>Test als Bestanden dokumentiert; in der geprüften Sammlung kein eigener Screenshot mit T30-Präfix.</w:t>
+              <w:t>Bestanden; eigener Abschlussnachweis vorhanden: screenshots/21_tests/T30_prod_abnahme_e2e_http200.png</w:t>
             </w:r>
           </w:p>
         </w:tc>
@@ -3657,10 +3636,7 @@
           </w:tcPr>
           <w:p>
             <w:r>
-              <w:rPr>
-                <w:sz w:val="15"/>
-              </w:rPr>
-              <w:t>T01–T29, F01–F08 und D01–D15 besitzen zugeordnete Screenshots</w:t>
+              <w:t>T01–T30, F01–F08 und D01–D15 besitzen zugeordnete Nachweise</w:t>
             </w:r>
           </w:p>
         </w:tc>
@@ -3671,10 +3647,7 @@
           </w:tcPr>
           <w:p>
             <w:r>
-              <w:rPr>
-                <w:sz w:val="15"/>
-              </w:rPr>
-              <w:t>Weitgehend vollständig.</w:t>
+              <w:t>Vollständig auf Protokoll-/Nachweisebene.</w:t>
             </w:r>
           </w:p>
         </w:tc>
@@ -3701,10 +3674,7 @@
           </w:tcPr>
           <w:p>
             <w:r>
-              <w:rPr>
-                <w:sz w:val="15"/>
-              </w:rPr>
-              <w:t>Kein eigener T30-Präfix im geprüften Ordner</w:t>
+              <w:t>Eigener T30-Abschlussnachweis vorhanden: screenshots/21_tests/T30_prod_abnahme_e2e_http200.png</w:t>
             </w:r>
           </w:p>
         </w:tc>
@@ -3715,10 +3685,7 @@
           </w:tcPr>
           <w:p>
             <w:r>
-              <w:rPr>
-                <w:sz w:val="15"/>
-              </w:rPr>
-              <w:t>Transparente Abweichung; vor finaler Abgabe idealerweise separaten Abschlussnachweis ergänzen.</w:t>
+              <w:t>Erfüllt.</w:t>
             </w:r>
           </w:p>
         </w:tc>
@@ -3784,7 +3751,7 @@
     </w:p>
     <w:p>
       <w:r>
-        <w:t>Die 30 Tests, acht Fehlerfälle und 15 DevOps-Fälle erfüllen den geforderten quantitativen Umfang. Die vorhandenen Nachweise decken T01–T29 sowie alle F- und D-Fälle explizit ab. Für T30 ist der produktive Endzustand mit pacman-prod Synced/Healthy, Pacman 3/3 Ready/Available, MongoDB 1/1 sowie HTTP 200 für Startseite und Highscore-Endpunkt im Testprotokoll dokumentiert; ein eigener T30-Screenshot wurde in der geprüften Screenshot-Sammlung jedoch nicht gefunden und wird deshalb nicht erfunden.</w:t>
+        <w:t>Die 30 Tests, acht Fehlerfälle und 15 DevOps-Fälle erfüllen den geforderten quantitativen Umfang. Die vorhandenen Nachweise decken T01–T30 sowie alle F- und D-Fälle ab. Für T30 ist der produktive Endzustand mit pacman-prod Synced/Healthy, Pacman 3/3 Ready/Available, MongoDB 1/1 sowie HTTP 200 für Startseite und Highscore-Endpunkt dokumentiert; der zugehörige Abschlussnachweis liegt unter screenshots/21_tests/T30_prod_abnahme_e2e_http200.png.</w:t>
       </w:r>
     </w:p>
     <w:sectPr>

</xml_diff>